<commit_message>
Add final combined exam document (Section 1 prompt engineering + Section 2 app)
Co-Authored-By: Claude Opus 5.5 <noreply@anthropic.com>
Claude-Session: https://claude.ai/code/session_01Wwgm6GXRzMGUQf1dF1vAYL
</commit_message>
<xml_diff>
--- a/Mid_Exam_Muhammad_Fawwad_Ahmed_B04-0923-000043ma.docx
+++ b/Mid_Exam_Muhammad_Fawwad_Ahmed_B04-0923-000043ma.docx
@@ -320,7 +320,7 @@
             </w:tcMar>
           </w:tcPr>
           <w:p>
-            <w:hyperlink w:history="1" r:id="rIde9gedonfwbsx2h34z5can">
+            <w:hyperlink w:history="1" r:id="rIdelflp3uz78qj1lrfuvgug">
               <w:r>
                 <w:rPr>
                   <w:rStyle w:val="Hyperlink"/>
@@ -380,7 +380,7 @@
             </w:tcMar>
           </w:tcPr>
           <w:p>
-            <w:hyperlink w:history="1" r:id="rIdxzpn00icmhxugfgdbeuzn">
+            <w:hyperlink w:history="1" r:id="rIdrrz_ui3frk3dxgpqlvfco">
               <w:r>
                 <w:rPr>
                   <w:rStyle w:val="Hyperlink"/>
@@ -440,7 +440,7 @@
             </w:tcMar>
           </w:tcPr>
           <w:p>
-            <w:hyperlink w:history="1" r:id="rIdamz1x4pm3pzh560nidfjy">
+            <w:hyperlink w:history="1" r:id="rIdbg3mfgusbrj_l8gwnceuc">
               <w:r>
                 <w:rPr>
                   <w:rStyle w:val="Hyperlink"/>
@@ -556,104 +556,6 @@
       </w:pPr>
       <w:r>
         <w:t xml:space="preserve">Quick test code</w:t>
-      </w:r>
-    </w:p>
-    <w:p>
-      <w:pPr>
-        <w:shd w:fill="F2F2F2" w:color="auto" w:val="clear"/>
-        <w:spacing w:after="0" w:line="240"/>
-      </w:pPr>
-      <w:r>
-        <w:rPr>
-          <w:rFonts w:ascii="Consolas" w:cs="Consolas" w:eastAsia="Consolas" w:hAnsi="Consolas"/>
-          <w:sz w:val="16"/>
-          <w:szCs w:val="16"/>
-        </w:rPr>
-        <w:t xml:space="preserve">"""Task 2.1 – load the zero-shot pipeline and run one quick test.</w:t>
-      </w:r>
-    </w:p>
-    <w:p>
-      <w:pPr>
-        <w:shd w:fill="F2F2F2" w:color="auto" w:val="clear"/>
-        <w:spacing w:after="0" w:line="240"/>
-      </w:pPr>
-      <w:r>
-        <w:rPr>
-          <w:rFonts w:ascii="Consolas" w:cs="Consolas" w:eastAsia="Consolas" w:hAnsi="Consolas"/>
-          <w:sz w:val="16"/>
-          <w:szCs w:val="16"/>
-        </w:rPr>
-        <w:t xml:space="preserve"> </w:t>
-      </w:r>
-    </w:p>
-    <w:p>
-      <w:pPr>
-        <w:shd w:fill="F2F2F2" w:color="auto" w:val="clear"/>
-        <w:spacing w:after="0" w:line="240"/>
-      </w:pPr>
-      <w:r>
-        <w:rPr>
-          <w:rFonts w:ascii="Consolas" w:cs="Consolas" w:eastAsia="Consolas" w:hAnsi="Consolas"/>
-          <w:sz w:val="16"/>
-          <w:szCs w:val="16"/>
-        </w:rPr>
-        <w:t xml:space="preserve">Run in Google Colab:</w:t>
-      </w:r>
-    </w:p>
-    <w:p>
-      <w:pPr>
-        <w:shd w:fill="F2F2F2" w:color="auto" w:val="clear"/>
-        <w:spacing w:after="0" w:line="240"/>
-      </w:pPr>
-      <w:r>
-        <w:rPr>
-          <w:rFonts w:ascii="Consolas" w:cs="Consolas" w:eastAsia="Consolas" w:hAnsi="Consolas"/>
-          <w:sz w:val="16"/>
-          <w:szCs w:val="16"/>
-        </w:rPr>
-        <w:t xml:space="preserve">    !pip install -q transformers torch</w:t>
-      </w:r>
-    </w:p>
-    <w:p>
-      <w:pPr>
-        <w:shd w:fill="F2F2F2" w:color="auto" w:val="clear"/>
-        <w:spacing w:after="0" w:line="240"/>
-      </w:pPr>
-      <w:r>
-        <w:rPr>
-          <w:rFonts w:ascii="Consolas" w:cs="Consolas" w:eastAsia="Consolas" w:hAnsi="Consolas"/>
-          <w:sz w:val="16"/>
-          <w:szCs w:val="16"/>
-        </w:rPr>
-        <w:t xml:space="preserve">    !python task_2_1_test_model.py</w:t>
-      </w:r>
-    </w:p>
-    <w:p>
-      <w:pPr>
-        <w:shd w:fill="F2F2F2" w:color="auto" w:val="clear"/>
-        <w:spacing w:after="0" w:line="240"/>
-      </w:pPr>
-      <w:r>
-        <w:rPr>
-          <w:rFonts w:ascii="Consolas" w:cs="Consolas" w:eastAsia="Consolas" w:hAnsi="Consolas"/>
-          <w:sz w:val="16"/>
-          <w:szCs w:val="16"/>
-        </w:rPr>
-        <w:t xml:space="preserve">"""</w:t>
-      </w:r>
-    </w:p>
-    <w:p>
-      <w:pPr>
-        <w:shd w:fill="F2F2F2" w:color="auto" w:val="clear"/>
-        <w:spacing w:after="0" w:line="240"/>
-      </w:pPr>
-      <w:r>
-        <w:rPr>
-          <w:rFonts w:ascii="Consolas" w:cs="Consolas" w:eastAsia="Consolas" w:hAnsi="Consolas"/>
-          <w:sz w:val="16"/>
-          <w:szCs w:val="16"/>
-        </w:rPr>
-        <w:t xml:space="preserve"> </w:t>
       </w:r>
     </w:p>
     <w:p>
@@ -1283,8 +1185,6 @@
         <w:pBdr>
           <w:top w:val="single" w:color="BFBFBF" w:sz="4"/>
           <w:bottom w:val="single" w:color="BFBFBF" w:sz="4"/>
-          <w:left w:val="single" w:color="BFBFBF" w:sz="4"/>
-          <w:right w:val="single" w:color="BFBFBF" w:sz="4"/>
         </w:pBdr>
         <w:shd w:fill="FFF8E1" w:color="auto" w:val="clear"/>
         <w:spacing w:after="120"/>
@@ -3389,7 +3289,7 @@
             </w:tcMar>
           </w:tcPr>
           <w:p>
-            <w:hyperlink w:history="1" r:id="rId8bijvnqeqzj7h_s9mjtbu">
+            <w:hyperlink w:history="1" r:id="rId9eddrnotcbhjoz_ohqmr1">
               <w:r>
                 <w:rPr>
                   <w:rStyle w:val="Hyperlink"/>
@@ -3449,7 +3349,7 @@
             </w:tcMar>
           </w:tcPr>
           <w:p>
-            <w:hyperlink w:history="1" r:id="rIdoivtrlexbalkyev7frue8">
+            <w:hyperlink w:history="1" r:id="rIdwnma3lbg67kz1giczod20">
               <w:r>
                 <w:rPr>
                   <w:rStyle w:val="Hyperlink"/>
@@ -3509,7 +3409,7 @@
             </w:tcMar>
           </w:tcPr>
           <w:p>
-            <w:hyperlink w:history="1" r:id="rIdk_rnbuffvoftetx7qru9p">
+            <w:hyperlink w:history="1" r:id="rIdzw_g7jjnefbipz14udyd-">
               <w:r>
                 <w:rPr>
                   <w:rStyle w:val="Hyperlink"/>

</xml_diff>